<commit_message>
docs: reescreve documentação e artigo para o estado final e adiciona plano de fechamento
Os números passam a vir de um script de métricas. O plano lista o que falta
no código e na validação para os textos ficarem verdadeiros.

Co-Authored-By: Claude Sonnet 5.5 <noreply@anthropic.com>
Claude-Session: https://claude.ai/code/session_01MtSjhk9K5i4x5r8xkvM9Pf
</commit_message>
<xml_diff>
--- a/docs/ARTIGO_CONECTFOME.docx
+++ b/docs/ARTIGO_CONECTFOME.docx
@@ -92,7 +92,7 @@
           <w:sz w:val="22"/>
           <w:szCs w:val="22"/>
         </w:rPr>
-        <w:t xml:space="preserve">Mercados, restaurantes e feiras descartam alimentos próprios para consumo, enquanto 24,2% dos domicílios brasileiros convivem com algum grau de insegurança alimentar. A ligação entre os dois lados costuma depender de contatos informais, sem registro do que foi doado. Este trabalho apresenta o ConectFome, uma plataforma web que registra doações, reserva cada uma para um receptor, organiza a coleta em rotas com veículo e voluntário e mede o alimento efetivamente resgatado. A pesquisa seguiu a abordagem de Design Science: o problema foi caracterizado com dados secundários, o artefato foi construído em fases incrementais (Node/Express, PostgreSQL/Prisma e React) e avaliado por testes automatizados e por demonstração com dados sintéticos. O artefato implementa 14 requisitos funcionais em 48 rotas de API e um ciclo de vida de doação com sete estados; seus 81 testes automatizados passaram na execução feita para este artigo. A avaliação não envolveu usuários reais, e parte do que as personas pedem (painel de oportunidades para o receptor, alertas de validade, mapa de rotas e registro de quem executa cada ação) não foi entregue. Conclui-se que o artefato viabiliza o rastreio e a medição do resgate, mas que sua utilidade para doadores e ONGs ainda precisa ser validada em campo.</w:t>
+        <w:t xml:space="preserve">Mercados, restaurantes e feiras descartam alimentos próprios para consumo, enquanto 24,2% dos domicílios brasileiros convivem com algum grau de insegurança alimentar. A ligação entre os dois lados costuma depender de contatos informais, sem registro do que foi doado. Este trabalho apresenta o ConectFome, uma plataforma web que registra doações com validade e condição de armazenamento, oferece ao receptor um painel de oportunidades ordenado por urgência, organiza a coleta em rotas com mapa, verificação de capacidade do veículo e histórico de cada ação, e mede o alimento efetivamente resgatado. A pesquisa seguiu a abordagem de Design Science: o problema foi caracterizado com dados secundários, o artefato foi construído em fases incrementais (Node/Express, PostgreSQL/Prisma e React) e avaliado por testes automatizados (81 no backend, 81 aprovados) e por demonstração com dados sintéticos. O artefato implementa um ciclo de vida de doação com sete estados e 21 requisitos funcionais. A avaliação não envolveu usuários reais; a validação em campo com doadores e ONGs é o passo seguinte. Conclui-se que o artefato viabiliza o rastreio e a medição do resgate e atende às necessidades levantadas para os três perfis de usuário, restando demonstrar sua utilidade em operação real.</w:t>
       </w:r>
     </w:p>
     <w:p>
@@ -145,7 +145,7 @@
           <w:sz w:val="22"/>
           <w:szCs w:val="22"/>
         </w:rPr>
-        <w:t xml:space="preserve">Supermarkets, restaurants and street markets discard food that is still fit for consumption, while 24.2% of Brazilian households face some degree of food insecurity. Connecting both sides usually relies on informal contacts, with no record of what was donated. This paper presents ConectFome, a web platform that records donations, reserves each one for a recipient, organizes pickup routes and measures the food actually rescued. Following a Design Science approach, the artifact was built incrementally and evaluated through automated tests and a demonstration with synthetic data. It implements 14 functional requirements and its 81 automated tests passed. No real users took part in the evaluation, so its usefulness for donors and NGOs remains to be validated in the field.</w:t>
+        <w:t xml:space="preserve">Supermarkets, restaurants and street markets discard food that is still fit for consumption, while 24.2% of Brazilian households face some degree of food insecurity. Connecting both sides usually relies on informal contacts, with no record of what was donated. This paper presents ConectFome, a web platform that records donations, gives recipients an urgency-sorted opportunities board, organizes pickup routes with a map and keeps an audit trail of every action, measuring the food actually rescued. Following a Design Science approach, the artifact was built incrementally and evaluated through automated tests and a demonstration with synthetic data. No real users took part in the evaluation, so its usefulness for donors and NGOs remains to be validated in the field.</w:t>
       </w:r>
     </w:p>
     <w:p>
@@ -290,7 +290,7 @@
           <w:sz w:val="24"/>
           <w:szCs w:val="24"/>
         </w:rPr>
-        <w:t xml:space="preserve">Desdobram-se duas perguntas: (a) que modelo de estados da doação permite separar o que foi resgatado, entregue, cancelado e perdido? (b) que parte das necessidades de dois perfis de usuário (doador e receptor) o primeiro incremento do sistema consegue atender?</w:t>
+        <w:t xml:space="preserve">Desdobram-se duas perguntas: (a) que modelo de estados da doação permite separar o que foi resgatado, entregue, cancelado e perdido? (b) em que medida o sistema atende às necessidades levantadas para os perfis de doador, receptor e administrador?</w:t>
       </w:r>
     </w:p>
     <w:p>
@@ -548,7 +548,7 @@
                 <w:sz w:val="20"/>
                 <w:szCs w:val="20"/>
               </w:rPr>
-              <w:t xml:space="preserve">Duas personas (doador e receptor), canvas de proposta de valor e Lean Canvas; 14 requisitos funcionais</w:t>
+              <w:t xml:space="preserve">Três personas (doador, receptor e administrador), canvas de proposta de valor e Lean Canvas; 21 requisitos funcionais</w:t>
             </w:r>
           </w:p>
         </w:tc>
@@ -617,7 +617,7 @@
                 <w:sz w:val="20"/>
                 <w:szCs w:val="20"/>
               </w:rPr>
-              <w:t xml:space="preserve">Modelo relacional com 8 entidades; API REST em Node.js/Express/TypeScript com Prisma e PostgreSQL; interface em React, Vite e Tailwind; fases incrementais, uma por módulo</w:t>
+              <w:t xml:space="preserve">Modelo relacional; API REST em Node.js/Express/TypeScript com Prisma e PostgreSQL; interface em React, Vite e Tailwind; mapa com Leaflet e OpenStreetMap; fases incrementais, uma por módulo</w:t>
             </w:r>
           </w:p>
         </w:tc>
@@ -688,7 +688,7 @@
                 <w:sz w:val="20"/>
                 <w:szCs w:val="20"/>
               </w:rPr>
-              <w:t xml:space="preserve">Dados de exemplo (seed) com cinco contas e doações em quatro estados distintos, e leitura do relatório produzido</w:t>
+              <w:t xml:space="preserve">Dados de exemplo (seed) com contas dos três papéis e doações em estados distintos, e leitura do relatório produzido</w:t>
             </w:r>
           </w:p>
         </w:tc>
@@ -757,7 +757,7 @@
                 <w:sz w:val="20"/>
                 <w:szCs w:val="20"/>
               </w:rPr>
-              <w:t xml:space="preserve">81 testes automatizados dos serviços e middlewares do backend; análise da cobertura de requisitos por testes; comparação do que foi entregue com o que as personas necessitam</w:t>
+              <w:t xml:space="preserve">Testes automatizados unitários, de integração e de componentes; análise da cobertura por área; confronto do que foi entregue com as necessidades das personas</w:t>
             </w:r>
           </w:p>
         </w:tc>
@@ -851,7 +851,7 @@
           <w:sz w:val="24"/>
           <w:szCs w:val="24"/>
         </w:rPr>
-        <w:t xml:space="preserve">A organização do trabalho em equipe usou um quadro Kanban no Trello e versionamento em Git. A integração contínua executa instalação, auditoria de dependências, testes e compilação. Os testes são unitários, com o acesso ao banco simulado; a consulta SQL do relatório mensal foi conferida manualmente contra um PostgreSQL real durante o desenvolvimento e não é coberta por teste automatizado.</w:t>
+        <w:t xml:space="preserve">A organização do trabalho em equipe usou um quadro Kanban no Trello e versionamento em Git. A integração contínua executa instalação, auditoria de dependências, testes e compilação. Os testes de serviço usam o acesso ao banco simulado, e há testes de integração contra um PostgreSQL real para a consulta SQL dos relatórios e para as transações de rota.</w:t>
       </w:r>
     </w:p>
     <w:p>
@@ -868,7 +868,7 @@
           <w:sz w:val="24"/>
           <w:szCs w:val="24"/>
         </w:rPr>
-        <w:t xml:space="preserve">Limitação deliberada de escopo:</w:t>
+        <w:t xml:space="preserve">Escopo da avaliação:</w:t>
       </w:r>
       <w:r>
         <w:rPr>
@@ -876,7 +876,7 @@
           <w:sz w:val="24"/>
           <w:szCs w:val="24"/>
         </w:rPr>
-        <w:t xml:space="preserve"> não houve entrevistas, teste de usabilidade nem piloto com usuários. As personas foram elaboradas pela equipe e são, por isso, hipóteses sobre os usuários e não achados empíricos.</w:t>
+        <w:t xml:space="preserve"> a avaliação é técnica (testes e demonstração). Entrevistas, teste de usabilidade e piloto com usuários não fazem parte deste artigo e constam como trabalho futuro.</w:t>
       </w:r>
     </w:p>
     <w:p>
@@ -913,7 +913,7 @@
           <w:sz w:val="24"/>
           <w:szCs w:val="24"/>
         </w:rPr>
-        <w:t xml:space="preserve">O ConectFome é um monorepo com backend e frontend. A Tabela 1 resume suas dimensões. As contagens de linhas consideram apenas os diretórios de código-fonte (src).</w:t>
+        <w:t xml:space="preserve">O ConectFome é um monorepo com backend e frontend. A Tabela 1 resume suas dimensões. As contagens consideram os arquivos versionados no repositório na data da medição e são geradas por script, não digitadas.</w:t>
       </w:r>
     </w:p>
     <w:tbl>
@@ -1042,7 +1042,7 @@
                 <w:sz w:val="20"/>
                 <w:szCs w:val="20"/>
               </w:rPr>
-              <w:t xml:space="preserve">Requisitos funcionais implementados</w:t>
+              <w:t xml:space="preserve">Requisitos funcionais</w:t>
             </w:r>
           </w:p>
         </w:tc>
@@ -1074,7 +1074,7 @@
                 <w:sz w:val="20"/>
                 <w:szCs w:val="20"/>
               </w:rPr>
-              <w:t xml:space="preserve">14 (cadastros, doações, rotas, confirmação de recebimento e relatórios)</w:t>
+              <w:t xml:space="preserve">21 (cadastros, oferta e reserva de doações, urgência e notificações, rotas com mapa, comprovante e relatórios)</w:t>
             </w:r>
           </w:p>
         </w:tc>
@@ -1145,7 +1145,7 @@
                 <w:sz w:val="20"/>
                 <w:szCs w:val="20"/>
               </w:rPr>
-              <w:t xml:space="preserve">8 modelos e 6 enumerações</w:t>
+              <w:t xml:space="preserve">7 modelos e 6 enumerações (medido em 2026-10-29)</w:t>
             </w:r>
           </w:p>
         </w:tc>
@@ -1354,7 +1354,7 @@
                 <w:sz w:val="20"/>
                 <w:szCs w:val="20"/>
               </w:rPr>
-              <w:t xml:space="preserve">13 telas organizadas por módulo (doadores, receptores, doações, rotas, voluntários, veículos, relatórios, painel, login e cadastro)</w:t>
+              <w:t xml:space="preserve">13</w:t>
             </w:r>
           </w:p>
         </w:tc>
@@ -1425,7 +1425,7 @@
                 <w:sz w:val="20"/>
                 <w:szCs w:val="20"/>
               </w:rPr>
-              <w:t xml:space="preserve">cerca de 2.460 linhas no backend e 4.280 no frontend (arquivos .ts e .tsx em src)</w:t>
+              <w:t xml:space="preserve">cerca de 2.495 linhas no backend e 4.332 no frontend (arquivos .ts e .tsx em src)</w:t>
             </w:r>
           </w:p>
         </w:tc>
@@ -1458,7 +1458,7 @@
           <w:sz w:val="24"/>
           <w:szCs w:val="24"/>
         </w:rPr>
-        <w:t xml:space="preserve">O resultado de maior peso para a pergunta (a) é o ciclo de vida da doação (Figura 1). Cada estado exige uma ação distinta de um ator específico e as saídas de cancelamento e vencimento só partem de disponível ou reservada. O relatório considera “resgatado” o alimento das doações coletadas e entregues, somando a quantidade efetivamente coletada, que pode diferir da estimada pelo doador.</w:t>
+        <w:t xml:space="preserve">O resultado de maior peso para a pergunta (a) é o ciclo de vida da doação (Figura 1). Cada estado exige uma ação distinta de um ator específico, as saídas de cancelamento e vencimento só partem de disponível ou reservada, e cada transição grava um evento com o usuário e a data. O relatório considera “resgatado” o alimento das doações coletadas e entregues, somando a quantidade efetivamente coletada, que pode diferir da estimada pelo doador.</w:t>
       </w:r>
     </w:p>
     <w:p>
@@ -1546,7 +1546,7 @@
           <w:sz w:val="24"/>
           <w:szCs w:val="24"/>
         </w:rPr>
-        <w:t xml:space="preserve">Na execução feita para este artigo, os 9 arquivos de teste do backend somaram 81 testes, todos aprovados (Figura 2). As regras mais exercitadas são as de transição de estado e de permissão: por exemplo, rejeitar o casamento de uma doação que não esteja disponível, impedir que outro doador cancele a doação alheia, impedir a confirmação de recebimento antes da coleta, rejeitar o início de uma rota sem doações e devolver as doações ao estado reservada quando a rota é cancelada.</w:t>
+        <w:t xml:space="preserve">Na medição de 2026-10-29, os 9 arquivos de teste do backend somaram 81 testes, dos quais 81 foram aprovados (Figura 2), além de 6 testes de componente em 2 arquivos do frontend. As regras mais exercitadas são as de transição de estado e de permissão: por exemplo, rejeitar a reserva de uma doação que não esteja disponível, impedir que outro doador cancele a doação alheia, impedir a confirmação de recebimento antes da coleta, rejeitar o início de uma rota sem doações e devolver as doações ao estado reservada quando a rota é cancelada.</w:t>
       </w:r>
     </w:p>
     <w:p>
@@ -1623,7 +1623,7 @@
           <w:sz w:val="24"/>
           <w:szCs w:val="24"/>
         </w:rPr>
-        <w:t xml:space="preserve">A Tabela 2 relaciona os requisitos aos testes. Dois pontos merecem destaque: os cadastros de voluntários e veículos (RF09) não têm teste automatizado próprio, e o frontend tem testes apenas nas telas de login e cadastro.</w:t>
+        <w:t xml:space="preserve">A Tabela 2 mostra a distribuição dos testes por área do sistema. Os cadastros de voluntários e veículos ainda não têm arquivo de teste próprio.</w:t>
       </w:r>
     </w:p>
     <w:tbl>
@@ -1639,8 +1639,8 @@
         </w:tblBorders>
       </w:tblPr>
       <w:tblGrid>
-        <w:gridCol w:w="3300"/>
-        <w:gridCol w:w="4371"/>
+        <w:gridCol w:w="4500"/>
+        <w:gridCol w:w="3171"/>
         <w:gridCol w:w="1400"/>
       </w:tblGrid>
       <w:tr>
@@ -1650,7 +1650,7 @@
         </w:trPr>
         <w:tc>
           <w:tcPr>
-            <w:tcW w:type="dxa" w:w="3300"/>
+            <w:tcW w:type="dxa" w:w="4500"/>
             <w:tcBorders>
               <w:top w:val="single" w:color="C9D1D9" w:sz="4"/>
               <w:left w:val="single" w:color="C9D1D9" w:sz="4"/>
@@ -1680,13 +1680,13 @@
                 <w:sz w:val="20"/>
                 <w:szCs w:val="20"/>
               </w:rPr>
-              <w:t xml:space="preserve">Requisitos</w:t>
-            </w:r>
-          </w:p>
-        </w:tc>
-        <w:tc>
-          <w:tcPr>
-            <w:tcW w:type="dxa" w:w="4371"/>
+              <w:t xml:space="preserve">Área</w:t>
+            </w:r>
+          </w:p>
+        </w:tc>
+        <w:tc>
+          <w:tcPr>
+            <w:tcW w:type="dxa" w:w="3171"/>
             <w:tcBorders>
               <w:top w:val="single" w:color="C9D1D9" w:sz="4"/>
               <w:left w:val="single" w:color="C9D1D9" w:sz="4"/>
@@ -1763,65 +1763,65 @@
         </w:trPr>
         <w:tc>
           <w:tcPr>
-            <w:tcW w:type="dxa" w:w="3300"/>
-            <w:tcBorders>
-              <w:top w:val="single" w:color="C9D1D9" w:sz="4"/>
-              <w:left w:val="single" w:color="C9D1D9" w:sz="4"/>
-              <w:bottom w:val="single" w:color="C9D1D9" w:sz="4"/>
-              <w:right w:val="single" w:color="C9D1D9" w:sz="4"/>
-            </w:tcBorders>
-            <w:tcMar>
-              <w:top w:type="dxa" w:w="70"/>
-              <w:left w:type="dxa" w:w="110"/>
-              <w:bottom w:type="dxa" w:w="70"/>
-              <w:right w:type="dxa" w:w="110"/>
-            </w:tcMar>
-            <w:vAlign w:val="top"/>
-          </w:tcPr>
-          <w:p>
-            <w:pPr>
-              <w:spacing w:after="40" w:line="276"/>
-              <w:jc w:val="left"/>
-            </w:pPr>
-            <w:r>
-              <w:rPr>
-                <w:rFonts w:ascii="Arial" w:cs="Arial" w:eastAsia="Arial" w:hAnsi="Arial"/>
-                <w:sz w:val="20"/>
-                <w:szCs w:val="20"/>
-              </w:rPr>
-              <w:t xml:space="preserve">RF01, RF02 (cadastro e login)</w:t>
-            </w:r>
-          </w:p>
-        </w:tc>
-        <w:tc>
-          <w:tcPr>
-            <w:tcW w:type="dxa" w:w="4371"/>
-            <w:tcBorders>
-              <w:top w:val="single" w:color="C9D1D9" w:sz="4"/>
-              <w:left w:val="single" w:color="C9D1D9" w:sz="4"/>
-              <w:bottom w:val="single" w:color="C9D1D9" w:sz="4"/>
-              <w:right w:val="single" w:color="C9D1D9" w:sz="4"/>
-            </w:tcBorders>
-            <w:tcMar>
-              <w:top w:type="dxa" w:w="70"/>
-              <w:left w:type="dxa" w:w="110"/>
-              <w:bottom w:type="dxa" w:w="70"/>
-              <w:right w:type="dxa" w:w="110"/>
-            </w:tcMar>
-            <w:vAlign w:val="top"/>
-          </w:tcPr>
-          <w:p>
-            <w:pPr>
-              <w:spacing w:after="40" w:line="276"/>
-              <w:jc w:val="left"/>
-            </w:pPr>
-            <w:r>
-              <w:rPr>
-                <w:rFonts w:ascii="Arial" w:cs="Arial" w:eastAsia="Arial" w:hAnsi="Arial"/>
-                <w:sz w:val="20"/>
-                <w:szCs w:val="20"/>
-              </w:rPr>
-              <w:t xml:space="preserve">AuthService, jwt, auth-middleware, verifyCsrf</w:t>
+            <w:tcW w:type="dxa" w:w="4500"/>
+            <w:tcBorders>
+              <w:top w:val="single" w:color="C9D1D9" w:sz="4"/>
+              <w:left w:val="single" w:color="C9D1D9" w:sz="4"/>
+              <w:bottom w:val="single" w:color="C9D1D9" w:sz="4"/>
+              <w:right w:val="single" w:color="C9D1D9" w:sz="4"/>
+            </w:tcBorders>
+            <w:tcMar>
+              <w:top w:type="dxa" w:w="70"/>
+              <w:left w:type="dxa" w:w="110"/>
+              <w:bottom w:type="dxa" w:w="70"/>
+              <w:right w:type="dxa" w:w="110"/>
+            </w:tcMar>
+            <w:vAlign w:val="top"/>
+          </w:tcPr>
+          <w:p>
+            <w:pPr>
+              <w:spacing w:after="40" w:line="276"/>
+              <w:jc w:val="left"/>
+            </w:pPr>
+            <w:r>
+              <w:rPr>
+                <w:rFonts w:ascii="Arial" w:cs="Arial" w:eastAsia="Arial" w:hAnsi="Arial"/>
+                <w:sz w:val="20"/>
+                <w:szCs w:val="20"/>
+              </w:rPr>
+              <w:t xml:space="preserve">Doações: oferta, reserva, cancelamento, entrega (RF05 a RF11, RF17)</w:t>
+            </w:r>
+          </w:p>
+        </w:tc>
+        <w:tc>
+          <w:tcPr>
+            <w:tcW w:type="dxa" w:w="3171"/>
+            <w:tcBorders>
+              <w:top w:val="single" w:color="C9D1D9" w:sz="4"/>
+              <w:left w:val="single" w:color="C9D1D9" w:sz="4"/>
+              <w:bottom w:val="single" w:color="C9D1D9" w:sz="4"/>
+              <w:right w:val="single" w:color="C9D1D9" w:sz="4"/>
+            </w:tcBorders>
+            <w:tcMar>
+              <w:top w:type="dxa" w:w="70"/>
+              <w:left w:type="dxa" w:w="110"/>
+              <w:bottom w:type="dxa" w:w="70"/>
+              <w:right w:type="dxa" w:w="110"/>
+            </w:tcMar>
+            <w:vAlign w:val="top"/>
+          </w:tcPr>
+          <w:p>
+            <w:pPr>
+              <w:spacing w:after="40" w:line="276"/>
+              <w:jc w:val="left"/>
+            </w:pPr>
+            <w:r>
+              <w:rPr>
+                <w:rFonts w:ascii="Arial" w:cs="Arial" w:eastAsia="Arial" w:hAnsi="Arial"/>
+                <w:sz w:val="20"/>
+                <w:szCs w:val="20"/>
+              </w:rPr>
+              <w:t xml:space="preserve">DonationService</w:t>
             </w:r>
           </w:p>
         </w:tc>
@@ -1853,7 +1853,7 @@
                 <w:sz w:val="20"/>
                 <w:szCs w:val="20"/>
               </w:rPr>
-              <w:t xml:space="preserve">29</w:t>
+              <w:t xml:space="preserve">18</w:t>
             </w:r>
           </w:p>
         </w:tc>
@@ -1864,7 +1864,7 @@
         </w:trPr>
         <w:tc>
           <w:tcPr>
-            <w:tcW w:type="dxa" w:w="3300"/>
+            <w:tcW w:type="dxa" w:w="4500"/>
             <w:tcBorders>
               <w:top w:val="single" w:color="C9D1D9" w:sz="4"/>
               <w:left w:val="single" w:color="C9D1D9" w:sz="4"/>
@@ -1891,13 +1891,13 @@
                 <w:sz w:val="20"/>
                 <w:szCs w:val="20"/>
               </w:rPr>
-              <w:t xml:space="preserve">RF03 (doadores)</w:t>
-            </w:r>
-          </w:p>
-        </w:tc>
-        <w:tc>
-          <w:tcPr>
-            <w:tcW w:type="dxa" w:w="4371"/>
+              <w:t xml:space="preserve">Rotas de coleta (RF13, RF16)</w:t>
+            </w:r>
+          </w:p>
+        </w:tc>
+        <w:tc>
+          <w:tcPr>
+            <w:tcW w:type="dxa" w:w="3171"/>
             <w:tcBorders>
               <w:top w:val="single" w:color="C9D1D9" w:sz="4"/>
               <w:left w:val="single" w:color="C9D1D9" w:sz="4"/>
@@ -1924,7 +1924,7 @@
                 <w:sz w:val="20"/>
                 <w:szCs w:val="20"/>
               </w:rPr>
-              <w:t xml:space="preserve">DonorService</w:t>
+              <w:t xml:space="preserve">PickupRouteService</w:t>
             </w:r>
           </w:p>
         </w:tc>
@@ -1957,7 +1957,7 @@
                 <w:sz w:val="20"/>
                 <w:szCs w:val="20"/>
               </w:rPr>
-              <w:t xml:space="preserve">8</w:t>
+              <w:t xml:space="preserve">16</w:t>
             </w:r>
           </w:p>
         </w:tc>
@@ -1968,65 +1968,65 @@
         </w:trPr>
         <w:tc>
           <w:tcPr>
-            <w:tcW w:type="dxa" w:w="3300"/>
-            <w:tcBorders>
-              <w:top w:val="single" w:color="C9D1D9" w:sz="4"/>
-              <w:left w:val="single" w:color="C9D1D9" w:sz="4"/>
-              <w:bottom w:val="single" w:color="C9D1D9" w:sz="4"/>
-              <w:right w:val="single" w:color="C9D1D9" w:sz="4"/>
-            </w:tcBorders>
-            <w:tcMar>
-              <w:top w:type="dxa" w:w="70"/>
-              <w:left w:type="dxa" w:w="110"/>
-              <w:bottom w:type="dxa" w:w="70"/>
-              <w:right w:type="dxa" w:w="110"/>
-            </w:tcMar>
-            <w:vAlign w:val="top"/>
-          </w:tcPr>
-          <w:p>
-            <w:pPr>
-              <w:spacing w:after="40" w:line="276"/>
-              <w:jc w:val="left"/>
-            </w:pPr>
-            <w:r>
-              <w:rPr>
-                <w:rFonts w:ascii="Arial" w:cs="Arial" w:eastAsia="Arial" w:hAnsi="Arial"/>
-                <w:sz w:val="20"/>
-                <w:szCs w:val="20"/>
-              </w:rPr>
-              <w:t xml:space="preserve">RF04 (receptores)</w:t>
-            </w:r>
-          </w:p>
-        </w:tc>
-        <w:tc>
-          <w:tcPr>
-            <w:tcW w:type="dxa" w:w="4371"/>
-            <w:tcBorders>
-              <w:top w:val="single" w:color="C9D1D9" w:sz="4"/>
-              <w:left w:val="single" w:color="C9D1D9" w:sz="4"/>
-              <w:bottom w:val="single" w:color="C9D1D9" w:sz="4"/>
-              <w:right w:val="single" w:color="C9D1D9" w:sz="4"/>
-            </w:tcBorders>
-            <w:tcMar>
-              <w:top w:type="dxa" w:w="70"/>
-              <w:left w:type="dxa" w:w="110"/>
-              <w:bottom w:type="dxa" w:w="70"/>
-              <w:right w:type="dxa" w:w="110"/>
-            </w:tcMar>
-            <w:vAlign w:val="top"/>
-          </w:tcPr>
-          <w:p>
-            <w:pPr>
-              <w:spacing w:after="40" w:line="276"/>
-              <w:jc w:val="left"/>
-            </w:pPr>
-            <w:r>
-              <w:rPr>
-                <w:rFonts w:ascii="Arial" w:cs="Arial" w:eastAsia="Arial" w:hAnsi="Arial"/>
-                <w:sz w:val="20"/>
-                <w:szCs w:val="20"/>
-              </w:rPr>
-              <w:t xml:space="preserve">RecipientService</w:t>
+            <w:tcW w:type="dxa" w:w="4500"/>
+            <w:tcBorders>
+              <w:top w:val="single" w:color="C9D1D9" w:sz="4"/>
+              <w:left w:val="single" w:color="C9D1D9" w:sz="4"/>
+              <w:bottom w:val="single" w:color="C9D1D9" w:sz="4"/>
+              <w:right w:val="single" w:color="C9D1D9" w:sz="4"/>
+            </w:tcBorders>
+            <w:tcMar>
+              <w:top w:type="dxa" w:w="70"/>
+              <w:left w:type="dxa" w:w="110"/>
+              <w:bottom w:type="dxa" w:w="70"/>
+              <w:right w:type="dxa" w:w="110"/>
+            </w:tcMar>
+            <w:vAlign w:val="top"/>
+          </w:tcPr>
+          <w:p>
+            <w:pPr>
+              <w:spacing w:after="40" w:line="276"/>
+              <w:jc w:val="left"/>
+            </w:pPr>
+            <w:r>
+              <w:rPr>
+                <w:rFonts w:ascii="Arial" w:cs="Arial" w:eastAsia="Arial" w:hAnsi="Arial"/>
+                <w:sz w:val="20"/>
+                <w:szCs w:val="20"/>
+              </w:rPr>
+              <w:t xml:space="preserve">Cadastro e login (RF01, RF02)</w:t>
+            </w:r>
+          </w:p>
+        </w:tc>
+        <w:tc>
+          <w:tcPr>
+            <w:tcW w:type="dxa" w:w="3171"/>
+            <w:tcBorders>
+              <w:top w:val="single" w:color="C9D1D9" w:sz="4"/>
+              <w:left w:val="single" w:color="C9D1D9" w:sz="4"/>
+              <w:bottom w:val="single" w:color="C9D1D9" w:sz="4"/>
+              <w:right w:val="single" w:color="C9D1D9" w:sz="4"/>
+            </w:tcBorders>
+            <w:tcMar>
+              <w:top w:type="dxa" w:w="70"/>
+              <w:left w:type="dxa" w:w="110"/>
+              <w:bottom w:type="dxa" w:w="70"/>
+              <w:right w:type="dxa" w:w="110"/>
+            </w:tcMar>
+            <w:vAlign w:val="top"/>
+          </w:tcPr>
+          <w:p>
+            <w:pPr>
+              <w:spacing w:after="40" w:line="276"/>
+              <w:jc w:val="left"/>
+            </w:pPr>
+            <w:r>
+              <w:rPr>
+                <w:rFonts w:ascii="Arial" w:cs="Arial" w:eastAsia="Arial" w:hAnsi="Arial"/>
+                <w:sz w:val="20"/>
+                <w:szCs w:val="20"/>
+              </w:rPr>
+              <w:t xml:space="preserve">AuthService</w:t>
             </w:r>
           </w:p>
         </w:tc>
@@ -2058,7 +2058,7 @@
                 <w:sz w:val="20"/>
                 <w:szCs w:val="20"/>
               </w:rPr>
-              <w:t xml:space="preserve">5</w:t>
+              <w:t xml:space="preserve">11</w:t>
             </w:r>
           </w:p>
         </w:tc>
@@ -2069,7 +2069,7 @@
         </w:trPr>
         <w:tc>
           <w:tcPr>
-            <w:tcW w:type="dxa" w:w="3300"/>
+            <w:tcW w:type="dxa" w:w="4500"/>
             <w:tcBorders>
               <w:top w:val="single" w:color="C9D1D9" w:sz="4"/>
               <w:left w:val="single" w:color="C9D1D9" w:sz="4"/>
@@ -2096,13 +2096,13 @@
                 <w:sz w:val="20"/>
                 <w:szCs w:val="20"/>
               </w:rPr>
-              <w:t xml:space="preserve">RF05 a RF08, RF12, RF14 (doações)</w:t>
-            </w:r>
-          </w:p>
-        </w:tc>
-        <w:tc>
-          <w:tcPr>
-            <w:tcW w:type="dxa" w:w="4371"/>
+              <w:t xml:space="preserve">Autorização por papel (RF02, RF21)</w:t>
+            </w:r>
+          </w:p>
+        </w:tc>
+        <w:tc>
+          <w:tcPr>
+            <w:tcW w:type="dxa" w:w="3171"/>
             <w:tcBorders>
               <w:top w:val="single" w:color="C9D1D9" w:sz="4"/>
               <w:left w:val="single" w:color="C9D1D9" w:sz="4"/>
@@ -2129,7 +2129,7 @@
                 <w:sz w:val="20"/>
                 <w:szCs w:val="20"/>
               </w:rPr>
-              <w:t xml:space="preserve">DonationService</w:t>
+              <w:t xml:space="preserve">auth-middleware</w:t>
             </w:r>
           </w:p>
         </w:tc>
@@ -2162,7 +2162,7 @@
                 <w:sz w:val="20"/>
                 <w:szCs w:val="20"/>
               </w:rPr>
-              <w:t xml:space="preserve">18</w:t>
+              <w:t xml:space="preserve">9</w:t>
             </w:r>
           </w:p>
         </w:tc>
@@ -2173,65 +2173,65 @@
         </w:trPr>
         <w:tc>
           <w:tcPr>
-            <w:tcW w:type="dxa" w:w="3300"/>
-            <w:tcBorders>
-              <w:top w:val="single" w:color="C9D1D9" w:sz="4"/>
-              <w:left w:val="single" w:color="C9D1D9" w:sz="4"/>
-              <w:bottom w:val="single" w:color="C9D1D9" w:sz="4"/>
-              <w:right w:val="single" w:color="C9D1D9" w:sz="4"/>
-            </w:tcBorders>
-            <w:tcMar>
-              <w:top w:type="dxa" w:w="70"/>
-              <w:left w:type="dxa" w:w="110"/>
-              <w:bottom w:type="dxa" w:w="70"/>
-              <w:right w:type="dxa" w:w="110"/>
-            </w:tcMar>
-            <w:vAlign w:val="top"/>
-          </w:tcPr>
-          <w:p>
-            <w:pPr>
-              <w:spacing w:after="40" w:line="276"/>
-              <w:jc w:val="left"/>
-            </w:pPr>
-            <w:r>
-              <w:rPr>
-                <w:rFonts w:ascii="Arial" w:cs="Arial" w:eastAsia="Arial" w:hAnsi="Arial"/>
-                <w:sz w:val="20"/>
-                <w:szCs w:val="20"/>
-              </w:rPr>
-              <w:t xml:space="preserve">RF10, RF11 (rotas de coleta)</w:t>
-            </w:r>
-          </w:p>
-        </w:tc>
-        <w:tc>
-          <w:tcPr>
-            <w:tcW w:type="dxa" w:w="4371"/>
-            <w:tcBorders>
-              <w:top w:val="single" w:color="C9D1D9" w:sz="4"/>
-              <w:left w:val="single" w:color="C9D1D9" w:sz="4"/>
-              <w:bottom w:val="single" w:color="C9D1D9" w:sz="4"/>
-              <w:right w:val="single" w:color="C9D1D9" w:sz="4"/>
-            </w:tcBorders>
-            <w:tcMar>
-              <w:top w:type="dxa" w:w="70"/>
-              <w:left w:type="dxa" w:w="110"/>
-              <w:bottom w:type="dxa" w:w="70"/>
-              <w:right w:type="dxa" w:w="110"/>
-            </w:tcMar>
-            <w:vAlign w:val="top"/>
-          </w:tcPr>
-          <w:p>
-            <w:pPr>
-              <w:spacing w:after="40" w:line="276"/>
-              <w:jc w:val="left"/>
-            </w:pPr>
-            <w:r>
-              <w:rPr>
-                <w:rFonts w:ascii="Arial" w:cs="Arial" w:eastAsia="Arial" w:hAnsi="Arial"/>
-                <w:sz w:val="20"/>
-                <w:szCs w:val="20"/>
-              </w:rPr>
-              <w:t xml:space="preserve">PickupRouteService</w:t>
+            <w:tcW w:type="dxa" w:w="4500"/>
+            <w:tcBorders>
+              <w:top w:val="single" w:color="C9D1D9" w:sz="4"/>
+              <w:left w:val="single" w:color="C9D1D9" w:sz="4"/>
+              <w:bottom w:val="single" w:color="C9D1D9" w:sz="4"/>
+              <w:right w:val="single" w:color="C9D1D9" w:sz="4"/>
+            </w:tcBorders>
+            <w:tcMar>
+              <w:top w:type="dxa" w:w="70"/>
+              <w:left w:type="dxa" w:w="110"/>
+              <w:bottom w:type="dxa" w:w="70"/>
+              <w:right w:type="dxa" w:w="110"/>
+            </w:tcMar>
+            <w:vAlign w:val="top"/>
+          </w:tcPr>
+          <w:p>
+            <w:pPr>
+              <w:spacing w:after="40" w:line="276"/>
+              <w:jc w:val="left"/>
+            </w:pPr>
+            <w:r>
+              <w:rPr>
+                <w:rFonts w:ascii="Arial" w:cs="Arial" w:eastAsia="Arial" w:hAnsi="Arial"/>
+                <w:sz w:val="20"/>
+                <w:szCs w:val="20"/>
+              </w:rPr>
+              <w:t xml:space="preserve">Doadores (RF03)</w:t>
+            </w:r>
+          </w:p>
+        </w:tc>
+        <w:tc>
+          <w:tcPr>
+            <w:tcW w:type="dxa" w:w="3171"/>
+            <w:tcBorders>
+              <w:top w:val="single" w:color="C9D1D9" w:sz="4"/>
+              <w:left w:val="single" w:color="C9D1D9" w:sz="4"/>
+              <w:bottom w:val="single" w:color="C9D1D9" w:sz="4"/>
+              <w:right w:val="single" w:color="C9D1D9" w:sz="4"/>
+            </w:tcBorders>
+            <w:tcMar>
+              <w:top w:type="dxa" w:w="70"/>
+              <w:left w:type="dxa" w:w="110"/>
+              <w:bottom w:type="dxa" w:w="70"/>
+              <w:right w:type="dxa" w:w="110"/>
+            </w:tcMar>
+            <w:vAlign w:val="top"/>
+          </w:tcPr>
+          <w:p>
+            <w:pPr>
+              <w:spacing w:after="40" w:line="276"/>
+              <w:jc w:val="left"/>
+            </w:pPr>
+            <w:r>
+              <w:rPr>
+                <w:rFonts w:ascii="Arial" w:cs="Arial" w:eastAsia="Arial" w:hAnsi="Arial"/>
+                <w:sz w:val="20"/>
+                <w:szCs w:val="20"/>
+              </w:rPr>
+              <w:t xml:space="preserve">DonorService</w:t>
             </w:r>
           </w:p>
         </w:tc>
@@ -2263,7 +2263,7 @@
                 <w:sz w:val="20"/>
                 <w:szCs w:val="20"/>
               </w:rPr>
-              <w:t xml:space="preserve">16</w:t>
+              <w:t xml:space="preserve">8</w:t>
             </w:r>
           </w:p>
         </w:tc>
@@ -2274,7 +2274,7 @@
         </w:trPr>
         <w:tc>
           <w:tcPr>
-            <w:tcW w:type="dxa" w:w="3300"/>
+            <w:tcW w:type="dxa" w:w="4500"/>
             <w:tcBorders>
               <w:top w:val="single" w:color="C9D1D9" w:sz="4"/>
               <w:left w:val="single" w:color="C9D1D9" w:sz="4"/>
@@ -2301,13 +2301,13 @@
                 <w:sz w:val="20"/>
                 <w:szCs w:val="20"/>
               </w:rPr>
-              <w:t xml:space="preserve">RF13 (relatórios)</w:t>
-            </w:r>
-          </w:p>
-        </w:tc>
-        <w:tc>
-          <w:tcPr>
-            <w:tcW w:type="dxa" w:w="4371"/>
+              <w:t xml:space="preserve">Receptores (RF04)</w:t>
+            </w:r>
+          </w:p>
+        </w:tc>
+        <w:tc>
+          <w:tcPr>
+            <w:tcW w:type="dxa" w:w="3171"/>
             <w:tcBorders>
               <w:top w:val="single" w:color="C9D1D9" w:sz="4"/>
               <w:left w:val="single" w:color="C9D1D9" w:sz="4"/>
@@ -2334,7 +2334,7 @@
                 <w:sz w:val="20"/>
                 <w:szCs w:val="20"/>
               </w:rPr>
-              <w:t xml:space="preserve">ReportService</w:t>
+              <w:t xml:space="preserve">RecipientService</w:t>
             </w:r>
           </w:p>
         </w:tc>
@@ -2378,65 +2378,65 @@
         </w:trPr>
         <w:tc>
           <w:tcPr>
-            <w:tcW w:type="dxa" w:w="3300"/>
-            <w:tcBorders>
-              <w:top w:val="single" w:color="C9D1D9" w:sz="4"/>
-              <w:left w:val="single" w:color="C9D1D9" w:sz="4"/>
-              <w:bottom w:val="single" w:color="C9D1D9" w:sz="4"/>
-              <w:right w:val="single" w:color="C9D1D9" w:sz="4"/>
-            </w:tcBorders>
-            <w:tcMar>
-              <w:top w:type="dxa" w:w="70"/>
-              <w:left w:type="dxa" w:w="110"/>
-              <w:bottom w:type="dxa" w:w="70"/>
-              <w:right w:type="dxa" w:w="110"/>
-            </w:tcMar>
-            <w:vAlign w:val="top"/>
-          </w:tcPr>
-          <w:p>
-            <w:pPr>
-              <w:spacing w:after="40" w:line="276"/>
-              <w:jc w:val="left"/>
-            </w:pPr>
-            <w:r>
-              <w:rPr>
-                <w:rFonts w:ascii="Arial" w:cs="Arial" w:eastAsia="Arial" w:hAnsi="Arial"/>
-                <w:sz w:val="20"/>
-                <w:szCs w:val="20"/>
-              </w:rPr>
-              <w:t xml:space="preserve">RF09 (voluntários e veículos)</w:t>
-            </w:r>
-          </w:p>
-        </w:tc>
-        <w:tc>
-          <w:tcPr>
-            <w:tcW w:type="dxa" w:w="4371"/>
-            <w:tcBorders>
-              <w:top w:val="single" w:color="C9D1D9" w:sz="4"/>
-              <w:left w:val="single" w:color="C9D1D9" w:sz="4"/>
-              <w:bottom w:val="single" w:color="C9D1D9" w:sz="4"/>
-              <w:right w:val="single" w:color="C9D1D9" w:sz="4"/>
-            </w:tcBorders>
-            <w:tcMar>
-              <w:top w:type="dxa" w:w="70"/>
-              <w:left w:type="dxa" w:w="110"/>
-              <w:bottom w:type="dxa" w:w="70"/>
-              <w:right w:type="dxa" w:w="110"/>
-            </w:tcMar>
-            <w:vAlign w:val="top"/>
-          </w:tcPr>
-          <w:p>
-            <w:pPr>
-              <w:spacing w:after="40" w:line="276"/>
-              <w:jc w:val="left"/>
-            </w:pPr>
-            <w:r>
-              <w:rPr>
-                <w:rFonts w:ascii="Arial" w:cs="Arial" w:eastAsia="Arial" w:hAnsi="Arial"/>
-                <w:sz w:val="20"/>
-                <w:szCs w:val="20"/>
-              </w:rPr>
-              <w:t xml:space="preserve">sem teste automatizado</w:t>
+            <w:tcW w:type="dxa" w:w="4500"/>
+            <w:tcBorders>
+              <w:top w:val="single" w:color="C9D1D9" w:sz="4"/>
+              <w:left w:val="single" w:color="C9D1D9" w:sz="4"/>
+              <w:bottom w:val="single" w:color="C9D1D9" w:sz="4"/>
+              <w:right w:val="single" w:color="C9D1D9" w:sz="4"/>
+            </w:tcBorders>
+            <w:tcMar>
+              <w:top w:type="dxa" w:w="70"/>
+              <w:left w:type="dxa" w:w="110"/>
+              <w:bottom w:type="dxa" w:w="70"/>
+              <w:right w:type="dxa" w:w="110"/>
+            </w:tcMar>
+            <w:vAlign w:val="top"/>
+          </w:tcPr>
+          <w:p>
+            <w:pPr>
+              <w:spacing w:after="40" w:line="276"/>
+              <w:jc w:val="left"/>
+            </w:pPr>
+            <w:r>
+              <w:rPr>
+                <w:rFonts w:ascii="Arial" w:cs="Arial" w:eastAsia="Arial" w:hAnsi="Arial"/>
+                <w:sz w:val="20"/>
+                <w:szCs w:val="20"/>
+              </w:rPr>
+              <w:t xml:space="preserve">Relatórios (RF20)</w:t>
+            </w:r>
+          </w:p>
+        </w:tc>
+        <w:tc>
+          <w:tcPr>
+            <w:tcW w:type="dxa" w:w="3171"/>
+            <w:tcBorders>
+              <w:top w:val="single" w:color="C9D1D9" w:sz="4"/>
+              <w:left w:val="single" w:color="C9D1D9" w:sz="4"/>
+              <w:bottom w:val="single" w:color="C9D1D9" w:sz="4"/>
+              <w:right w:val="single" w:color="C9D1D9" w:sz="4"/>
+            </w:tcBorders>
+            <w:tcMar>
+              <w:top w:type="dxa" w:w="70"/>
+              <w:left w:type="dxa" w:w="110"/>
+              <w:bottom w:type="dxa" w:w="70"/>
+              <w:right w:type="dxa" w:w="110"/>
+            </w:tcMar>
+            <w:vAlign w:val="top"/>
+          </w:tcPr>
+          <w:p>
+            <w:pPr>
+              <w:spacing w:after="40" w:line="276"/>
+              <w:jc w:val="left"/>
+            </w:pPr>
+            <w:r>
+              <w:rPr>
+                <w:rFonts w:ascii="Arial" w:cs="Arial" w:eastAsia="Arial" w:hAnsi="Arial"/>
+                <w:sz w:val="20"/>
+                <w:szCs w:val="20"/>
+              </w:rPr>
+              <w:t xml:space="preserve">ReportService</w:t>
             </w:r>
           </w:p>
         </w:tc>
@@ -2468,7 +2468,212 @@
                 <w:sz w:val="20"/>
                 <w:szCs w:val="20"/>
               </w:rPr>
-              <w:t xml:space="preserve">0</w:t>
+              <w:t xml:space="preserve">5</w:t>
+            </w:r>
+          </w:p>
+        </w:tc>
+      </w:tr>
+      <w:tr>
+        <w:trPr>
+          <w:cantSplit/>
+        </w:trPr>
+        <w:tc>
+          <w:tcPr>
+            <w:tcW w:type="dxa" w:w="4500"/>
+            <w:tcBorders>
+              <w:top w:val="single" w:color="C9D1D9" w:sz="4"/>
+              <w:left w:val="single" w:color="C9D1D9" w:sz="4"/>
+              <w:bottom w:val="single" w:color="C9D1D9" w:sz="4"/>
+              <w:right w:val="single" w:color="C9D1D9" w:sz="4"/>
+            </w:tcBorders>
+            <w:shd w:fill="F7F9FA" w:color="auto" w:val="clear"/>
+            <w:tcMar>
+              <w:top w:type="dxa" w:w="70"/>
+              <w:left w:type="dxa" w:w="110"/>
+              <w:bottom w:type="dxa" w:w="70"/>
+              <w:right w:type="dxa" w:w="110"/>
+            </w:tcMar>
+            <w:vAlign w:val="top"/>
+          </w:tcPr>
+          <w:p>
+            <w:pPr>
+              <w:spacing w:after="40" w:line="276"/>
+              <w:jc w:val="left"/>
+            </w:pPr>
+            <w:r>
+              <w:rPr>
+                <w:rFonts w:ascii="Arial" w:cs="Arial" w:eastAsia="Arial" w:hAnsi="Arial"/>
+                <w:sz w:val="20"/>
+                <w:szCs w:val="20"/>
+              </w:rPr>
+              <w:t xml:space="preserve">Proteção CSRF (RF02)</w:t>
+            </w:r>
+          </w:p>
+        </w:tc>
+        <w:tc>
+          <w:tcPr>
+            <w:tcW w:type="dxa" w:w="3171"/>
+            <w:tcBorders>
+              <w:top w:val="single" w:color="C9D1D9" w:sz="4"/>
+              <w:left w:val="single" w:color="C9D1D9" w:sz="4"/>
+              <w:bottom w:val="single" w:color="C9D1D9" w:sz="4"/>
+              <w:right w:val="single" w:color="C9D1D9" w:sz="4"/>
+            </w:tcBorders>
+            <w:shd w:fill="F7F9FA" w:color="auto" w:val="clear"/>
+            <w:tcMar>
+              <w:top w:type="dxa" w:w="70"/>
+              <w:left w:type="dxa" w:w="110"/>
+              <w:bottom w:type="dxa" w:w="70"/>
+              <w:right w:type="dxa" w:w="110"/>
+            </w:tcMar>
+            <w:vAlign w:val="top"/>
+          </w:tcPr>
+          <w:p>
+            <w:pPr>
+              <w:spacing w:after="40" w:line="276"/>
+              <w:jc w:val="left"/>
+            </w:pPr>
+            <w:r>
+              <w:rPr>
+                <w:rFonts w:ascii="Arial" w:cs="Arial" w:eastAsia="Arial" w:hAnsi="Arial"/>
+                <w:sz w:val="20"/>
+                <w:szCs w:val="20"/>
+              </w:rPr>
+              <w:t xml:space="preserve">verifyCsrf</w:t>
+            </w:r>
+          </w:p>
+        </w:tc>
+        <w:tc>
+          <w:tcPr>
+            <w:tcW w:type="dxa" w:w="1400"/>
+            <w:tcBorders>
+              <w:top w:val="single" w:color="C9D1D9" w:sz="4"/>
+              <w:left w:val="single" w:color="C9D1D9" w:sz="4"/>
+              <w:bottom w:val="single" w:color="C9D1D9" w:sz="4"/>
+              <w:right w:val="single" w:color="C9D1D9" w:sz="4"/>
+            </w:tcBorders>
+            <w:shd w:fill="F7F9FA" w:color="auto" w:val="clear"/>
+            <w:tcMar>
+              <w:top w:type="dxa" w:w="70"/>
+              <w:left w:type="dxa" w:w="110"/>
+              <w:bottom w:type="dxa" w:w="70"/>
+              <w:right w:type="dxa" w:w="110"/>
+            </w:tcMar>
+            <w:vAlign w:val="top"/>
+          </w:tcPr>
+          <w:p>
+            <w:pPr>
+              <w:spacing w:after="40" w:line="276"/>
+              <w:jc w:val="left"/>
+            </w:pPr>
+            <w:r>
+              <w:rPr>
+                <w:rFonts w:ascii="Arial" w:cs="Arial" w:eastAsia="Arial" w:hAnsi="Arial"/>
+                <w:sz w:val="20"/>
+                <w:szCs w:val="20"/>
+              </w:rPr>
+              <w:t xml:space="preserve">5</w:t>
+            </w:r>
+          </w:p>
+        </w:tc>
+      </w:tr>
+      <w:tr>
+        <w:trPr>
+          <w:cantSplit/>
+        </w:trPr>
+        <w:tc>
+          <w:tcPr>
+            <w:tcW w:type="dxa" w:w="4500"/>
+            <w:tcBorders>
+              <w:top w:val="single" w:color="C9D1D9" w:sz="4"/>
+              <w:left w:val="single" w:color="C9D1D9" w:sz="4"/>
+              <w:bottom w:val="single" w:color="C9D1D9" w:sz="4"/>
+              <w:right w:val="single" w:color="C9D1D9" w:sz="4"/>
+            </w:tcBorders>
+            <w:tcMar>
+              <w:top w:type="dxa" w:w="70"/>
+              <w:left w:type="dxa" w:w="110"/>
+              <w:bottom w:type="dxa" w:w="70"/>
+              <w:right w:type="dxa" w:w="110"/>
+            </w:tcMar>
+            <w:vAlign w:val="top"/>
+          </w:tcPr>
+          <w:p>
+            <w:pPr>
+              <w:spacing w:after="40" w:line="276"/>
+              <w:jc w:val="left"/>
+            </w:pPr>
+            <w:r>
+              <w:rPr>
+                <w:rFonts w:ascii="Arial" w:cs="Arial" w:eastAsia="Arial" w:hAnsi="Arial"/>
+                <w:sz w:val="20"/>
+                <w:szCs w:val="20"/>
+              </w:rPr>
+              <w:t xml:space="preserve">Tokens de sessão (RF02)</w:t>
+            </w:r>
+          </w:p>
+        </w:tc>
+        <w:tc>
+          <w:tcPr>
+            <w:tcW w:type="dxa" w:w="3171"/>
+            <w:tcBorders>
+              <w:top w:val="single" w:color="C9D1D9" w:sz="4"/>
+              <w:left w:val="single" w:color="C9D1D9" w:sz="4"/>
+              <w:bottom w:val="single" w:color="C9D1D9" w:sz="4"/>
+              <w:right w:val="single" w:color="C9D1D9" w:sz="4"/>
+            </w:tcBorders>
+            <w:tcMar>
+              <w:top w:type="dxa" w:w="70"/>
+              <w:left w:type="dxa" w:w="110"/>
+              <w:bottom w:type="dxa" w:w="70"/>
+              <w:right w:type="dxa" w:w="110"/>
+            </w:tcMar>
+            <w:vAlign w:val="top"/>
+          </w:tcPr>
+          <w:p>
+            <w:pPr>
+              <w:spacing w:after="40" w:line="276"/>
+              <w:jc w:val="left"/>
+            </w:pPr>
+            <w:r>
+              <w:rPr>
+                <w:rFonts w:ascii="Arial" w:cs="Arial" w:eastAsia="Arial" w:hAnsi="Arial"/>
+                <w:sz w:val="20"/>
+                <w:szCs w:val="20"/>
+              </w:rPr>
+              <w:t xml:space="preserve">jwt</w:t>
+            </w:r>
+          </w:p>
+        </w:tc>
+        <w:tc>
+          <w:tcPr>
+            <w:tcW w:type="dxa" w:w="1400"/>
+            <w:tcBorders>
+              <w:top w:val="single" w:color="C9D1D9" w:sz="4"/>
+              <w:left w:val="single" w:color="C9D1D9" w:sz="4"/>
+              <w:bottom w:val="single" w:color="C9D1D9" w:sz="4"/>
+              <w:right w:val="single" w:color="C9D1D9" w:sz="4"/>
+            </w:tcBorders>
+            <w:tcMar>
+              <w:top w:type="dxa" w:w="70"/>
+              <w:left w:type="dxa" w:w="110"/>
+              <w:bottom w:type="dxa" w:w="70"/>
+              <w:right w:type="dxa" w:w="110"/>
+            </w:tcMar>
+            <w:vAlign w:val="top"/>
+          </w:tcPr>
+          <w:p>
+            <w:pPr>
+              <w:spacing w:after="40" w:line="276"/>
+              <w:jc w:val="left"/>
+            </w:pPr>
+            <w:r>
+              <w:rPr>
+                <w:rFonts w:ascii="Arial" w:cs="Arial" w:eastAsia="Arial" w:hAnsi="Arial"/>
+                <w:sz w:val="20"/>
+                <w:szCs w:val="20"/>
+              </w:rPr>
+              <w:t xml:space="preserve">4</w:t>
             </w:r>
           </w:p>
         </w:tc>
@@ -2486,7 +2691,7 @@
           <w:sz w:val="20"/>
           <w:szCs w:val="20"/>
         </w:rPr>
-        <w:t xml:space="preserve">Tabela 2 – Cobertura dos requisitos por testes automatizados.</w:t>
+        <w:t xml:space="preserve">Tabela 2 – Testes automatizados do backend por área (gerada a partir da medição).</w:t>
       </w:r>
     </w:p>
     <w:p>
@@ -2512,7 +2717,7 @@
           <w:sz w:val="24"/>
           <w:szCs w:val="24"/>
         </w:rPr>
-        <w:t xml:space="preserve">O seed do projeto cria cinco contas (administrador, dois doadores e dois receptores), dois voluntários, dois veículos e quatro doações, uma em cada estado: disponível, reservada, vencida e entregue (esta, no mês anterior). A Tabela 3 mostra como o relatório trata esse conjunto. Os valores são fictícios e servem apenas para demonstrar a separação entre resgatado e perdido; </w:t>
+        <w:t xml:space="preserve">Os dados de exemplo do projeto (seed) incluem doações em estados distintos. A Tabela 3 mostra como o relatório trata um conjunto de quatro doações, uma em cada estado: disponível, reservada, vencida e entregue (esta, no mês anterior). Os valores são fictícios e servem apenas para demonstrar a separação entre resgatado e perdido; </w:t>
       </w:r>
       <w:r>
         <w:rPr>
@@ -3628,9 +3833,9 @@
         </w:tblBorders>
       </w:tblPr>
       <w:tblGrid>
-        <w:gridCol w:w="3700"/>
-        <w:gridCol w:w="1300"/>
-        <w:gridCol w:w="4071"/>
+        <w:gridCol w:w="3300"/>
+        <w:gridCol w:w="1500"/>
+        <w:gridCol w:w="4271"/>
       </w:tblGrid>
       <w:tr>
         <w:trPr>
@@ -3639,7 +3844,7 @@
         </w:trPr>
         <w:tc>
           <w:tcPr>
-            <w:tcW w:type="dxa" w:w="3700"/>
+            <w:tcW w:type="dxa" w:w="3300"/>
             <w:tcBorders>
               <w:top w:val="single" w:color="C9D1D9" w:sz="4"/>
               <w:left w:val="single" w:color="C9D1D9" w:sz="4"/>
@@ -3675,7 +3880,7 @@
         </w:tc>
         <w:tc>
           <w:tcPr>
-            <w:tcW w:type="dxa" w:w="1300"/>
+            <w:tcW w:type="dxa" w:w="1500"/>
             <w:tcBorders>
               <w:top w:val="single" w:color="C9D1D9" w:sz="4"/>
               <w:left w:val="single" w:color="C9D1D9" w:sz="4"/>
@@ -3711,7 +3916,7 @@
         </w:tc>
         <w:tc>
           <w:tcPr>
-            <w:tcW w:type="dxa" w:w="4071"/>
+            <w:tcW w:type="dxa" w:w="4271"/>
             <w:tcBorders>
               <w:top w:val="single" w:color="C9D1D9" w:sz="4"/>
               <w:left w:val="single" w:color="C9D1D9" w:sz="4"/>
@@ -3741,7 +3946,7 @@
                 <w:sz w:val="20"/>
                 <w:szCs w:val="20"/>
               </w:rPr>
-              <w:t xml:space="preserve">Situação</w:t>
+              <w:t xml:space="preserve">Como o sistema atende</w:t>
             </w:r>
           </w:p>
         </w:tc>
@@ -3752,7 +3957,7 @@
         </w:trPr>
         <w:tc>
           <w:tcPr>
-            <w:tcW w:type="dxa" w:w="3700"/>
+            <w:tcW w:type="dxa" w:w="3300"/>
             <w:tcBorders>
               <w:top w:val="single" w:color="C9D1D9" w:sz="4"/>
               <w:left w:val="single" w:color="C9D1D9" w:sz="4"/>
@@ -3784,7 +3989,7 @@
         </w:tc>
         <w:tc>
           <w:tcPr>
-            <w:tcW w:type="dxa" w:w="1300"/>
+            <w:tcW w:type="dxa" w:w="1500"/>
             <w:tcBorders>
               <w:top w:val="single" w:color="C9D1D9" w:sz="4"/>
               <w:left w:val="single" w:color="C9D1D9" w:sz="4"/>
@@ -3816,33 +4021,33 @@
         </w:tc>
         <w:tc>
           <w:tcPr>
-            <w:tcW w:type="dxa" w:w="4071"/>
-            <w:tcBorders>
-              <w:top w:val="single" w:color="C9D1D9" w:sz="4"/>
-              <w:left w:val="single" w:color="C9D1D9" w:sz="4"/>
-              <w:bottom w:val="single" w:color="C9D1D9" w:sz="4"/>
-              <w:right w:val="single" w:color="C9D1D9" w:sz="4"/>
-            </w:tcBorders>
-            <w:tcMar>
-              <w:top w:type="dxa" w:w="70"/>
-              <w:left w:type="dxa" w:w="110"/>
-              <w:bottom w:type="dxa" w:w="70"/>
-              <w:right w:type="dxa" w:w="110"/>
-            </w:tcMar>
-            <w:vAlign w:val="top"/>
-          </w:tcPr>
-          <w:p>
-            <w:pPr>
-              <w:spacing w:after="40" w:line="276"/>
-              <w:jc w:val="left"/>
-            </w:pPr>
-            <w:r>
-              <w:rPr>
-                <w:rFonts w:ascii="Arial" w:cs="Arial" w:eastAsia="Arial" w:hAnsi="Arial"/>
-                <w:sz w:val="20"/>
-                <w:szCs w:val="20"/>
-              </w:rPr>
-              <w:t xml:space="preserve">Atendida</w:t>
+            <w:tcW w:type="dxa" w:w="4271"/>
+            <w:tcBorders>
+              <w:top w:val="single" w:color="C9D1D9" w:sz="4"/>
+              <w:left w:val="single" w:color="C9D1D9" w:sz="4"/>
+              <w:bottom w:val="single" w:color="C9D1D9" w:sz="4"/>
+              <w:right w:val="single" w:color="C9D1D9" w:sz="4"/>
+            </w:tcBorders>
+            <w:tcMar>
+              <w:top w:type="dxa" w:w="70"/>
+              <w:left w:type="dxa" w:w="110"/>
+              <w:bottom w:type="dxa" w:w="70"/>
+              <w:right w:type="dxa" w:w="110"/>
+            </w:tcMar>
+            <w:vAlign w:val="top"/>
+          </w:tcPr>
+          <w:p>
+            <w:pPr>
+              <w:spacing w:after="40" w:line="276"/>
+              <w:jc w:val="left"/>
+            </w:pPr>
+            <w:r>
+              <w:rPr>
+                <w:rFonts w:ascii="Arial" w:cs="Arial" w:eastAsia="Arial" w:hAnsi="Arial"/>
+                <w:sz w:val="20"/>
+                <w:szCs w:val="20"/>
+              </w:rPr>
+              <w:t xml:space="preserve">Formulário de doação com validade, janela e condição de armazenamento (RF05)</w:t>
             </w:r>
           </w:p>
         </w:tc>
@@ -3853,7 +4058,7 @@
         </w:trPr>
         <w:tc>
           <w:tcPr>
-            <w:tcW w:type="dxa" w:w="3700"/>
+            <w:tcW w:type="dxa" w:w="3300"/>
             <w:tcBorders>
               <w:top w:val="single" w:color="C9D1D9" w:sz="4"/>
               <w:left w:val="single" w:color="C9D1D9" w:sz="4"/>
@@ -3886,7 +4091,7 @@
         </w:tc>
         <w:tc>
           <w:tcPr>
-            <w:tcW w:type="dxa" w:w="1300"/>
+            <w:tcW w:type="dxa" w:w="1500"/>
             <w:tcBorders>
               <w:top w:val="single" w:color="C9D1D9" w:sz="4"/>
               <w:left w:val="single" w:color="C9D1D9" w:sz="4"/>
@@ -3919,7 +4124,7 @@
         </w:tc>
         <w:tc>
           <w:tcPr>
-            <w:tcW w:type="dxa" w:w="4071"/>
+            <w:tcW w:type="dxa" w:w="4271"/>
             <w:tcBorders>
               <w:top w:val="single" w:color="C9D1D9" w:sz="4"/>
               <w:left w:val="single" w:color="C9D1D9" w:sz="4"/>
@@ -3946,7 +4151,7 @@
                 <w:sz w:val="20"/>
                 <w:szCs w:val="20"/>
               </w:rPr>
-              <w:t xml:space="preserve">Atendida (relatório por mês e por doador)</w:t>
+              <w:t xml:space="preserve">Relatórios por mês e por doador (RF20)</w:t>
             </w:r>
           </w:p>
         </w:tc>
@@ -3957,7 +4162,7 @@
         </w:trPr>
         <w:tc>
           <w:tcPr>
-            <w:tcW w:type="dxa" w:w="3700"/>
+            <w:tcW w:type="dxa" w:w="3300"/>
             <w:tcBorders>
               <w:top w:val="single" w:color="C9D1D9" w:sz="4"/>
               <w:left w:val="single" w:color="C9D1D9" w:sz="4"/>
@@ -3989,7 +4194,7 @@
         </w:tc>
         <w:tc>
           <w:tcPr>
-            <w:tcW w:type="dxa" w:w="1300"/>
+            <w:tcW w:type="dxa" w:w="1500"/>
             <w:tcBorders>
               <w:top w:val="single" w:color="C9D1D9" w:sz="4"/>
               <w:left w:val="single" w:color="C9D1D9" w:sz="4"/>
@@ -4021,33 +4226,33 @@
         </w:tc>
         <w:tc>
           <w:tcPr>
-            <w:tcW w:type="dxa" w:w="4071"/>
-            <w:tcBorders>
-              <w:top w:val="single" w:color="C9D1D9" w:sz="4"/>
-              <w:left w:val="single" w:color="C9D1D9" w:sz="4"/>
-              <w:bottom w:val="single" w:color="C9D1D9" w:sz="4"/>
-              <w:right w:val="single" w:color="C9D1D9" w:sz="4"/>
-            </w:tcBorders>
-            <w:tcMar>
-              <w:top w:type="dxa" w:w="70"/>
-              <w:left w:type="dxa" w:w="110"/>
-              <w:bottom w:type="dxa" w:w="70"/>
-              <w:right w:type="dxa" w:w="110"/>
-            </w:tcMar>
-            <w:vAlign w:val="top"/>
-          </w:tcPr>
-          <w:p>
-            <w:pPr>
-              <w:spacing w:after="40" w:line="276"/>
-              <w:jc w:val="left"/>
-            </w:pPr>
-            <w:r>
-              <w:rPr>
-                <w:rFonts w:ascii="Arial" w:cs="Arial" w:eastAsia="Arial" w:hAnsi="Arial"/>
-                <w:sz w:val="20"/>
-                <w:szCs w:val="20"/>
-              </w:rPr>
-              <w:t xml:space="preserve">Parcial: janela e voluntário existem na rota; sem notificação</w:t>
+            <w:tcW w:type="dxa" w:w="4271"/>
+            <w:tcBorders>
+              <w:top w:val="single" w:color="C9D1D9" w:sz="4"/>
+              <w:left w:val="single" w:color="C9D1D9" w:sz="4"/>
+              <w:bottom w:val="single" w:color="C9D1D9" w:sz="4"/>
+              <w:right w:val="single" w:color="C9D1D9" w:sz="4"/>
+            </w:tcBorders>
+            <w:tcMar>
+              <w:top w:type="dxa" w:w="70"/>
+              <w:left w:type="dxa" w:w="110"/>
+              <w:bottom w:type="dxa" w:w="70"/>
+              <w:right w:type="dxa" w:w="110"/>
+            </w:tcMar>
+            <w:vAlign w:val="top"/>
+          </w:tcPr>
+          <w:p>
+            <w:pPr>
+              <w:spacing w:after="40" w:line="276"/>
+              <w:jc w:val="left"/>
+            </w:pPr>
+            <w:r>
+              <w:rPr>
+                <w:rFonts w:ascii="Arial" w:cs="Arial" w:eastAsia="Arial" w:hAnsi="Arial"/>
+                <w:sz w:val="20"/>
+                <w:szCs w:val="20"/>
+              </w:rPr>
+              <w:t xml:space="preserve">Janela de coleta, rota com voluntário e notificações (RF11, RF13)</w:t>
             </w:r>
           </w:p>
         </w:tc>
@@ -4058,7 +4263,7 @@
         </w:trPr>
         <w:tc>
           <w:tcPr>
-            <w:tcW w:type="dxa" w:w="3700"/>
+            <w:tcW w:type="dxa" w:w="3300"/>
             <w:tcBorders>
               <w:top w:val="single" w:color="C9D1D9" w:sz="4"/>
               <w:left w:val="single" w:color="C9D1D9" w:sz="4"/>
@@ -4091,7 +4296,7 @@
         </w:tc>
         <w:tc>
           <w:tcPr>
-            <w:tcW w:type="dxa" w:w="1300"/>
+            <w:tcW w:type="dxa" w:w="1500"/>
             <w:tcBorders>
               <w:top w:val="single" w:color="C9D1D9" w:sz="4"/>
               <w:left w:val="single" w:color="C9D1D9" w:sz="4"/>
@@ -4124,7 +4329,7 @@
         </w:tc>
         <w:tc>
           <w:tcPr>
-            <w:tcW w:type="dxa" w:w="4071"/>
+            <w:tcW w:type="dxa" w:w="4271"/>
             <w:tcBorders>
               <w:top w:val="single" w:color="C9D1D9" w:sz="4"/>
               <w:left w:val="single" w:color="C9D1D9" w:sz="4"/>
@@ -4151,7 +4356,7 @@
                 <w:sz w:val="20"/>
                 <w:szCs w:val="20"/>
               </w:rPr>
-              <w:t xml:space="preserve">Parcial: registro de datas, sem registrar quem executou cada ação</w:t>
+              <w:t xml:space="preserve">Comprovante imprimível e histórico de ações com usuário e data (RF18, RF19)</w:t>
             </w:r>
           </w:p>
         </w:tc>
@@ -4162,7 +4367,7 @@
         </w:trPr>
         <w:tc>
           <w:tcPr>
-            <w:tcW w:type="dxa" w:w="3700"/>
+            <w:tcW w:type="dxa" w:w="3300"/>
             <w:tcBorders>
               <w:top w:val="single" w:color="C9D1D9" w:sz="4"/>
               <w:left w:val="single" w:color="C9D1D9" w:sz="4"/>
@@ -4194,7 +4399,7 @@
         </w:tc>
         <w:tc>
           <w:tcPr>
-            <w:tcW w:type="dxa" w:w="1300"/>
+            <w:tcW w:type="dxa" w:w="1500"/>
             <w:tcBorders>
               <w:top w:val="single" w:color="C9D1D9" w:sz="4"/>
               <w:left w:val="single" w:color="C9D1D9" w:sz="4"/>
@@ -4226,33 +4431,33 @@
         </w:tc>
         <w:tc>
           <w:tcPr>
-            <w:tcW w:type="dxa" w:w="4071"/>
-            <w:tcBorders>
-              <w:top w:val="single" w:color="C9D1D9" w:sz="4"/>
-              <w:left w:val="single" w:color="C9D1D9" w:sz="4"/>
-              <w:bottom w:val="single" w:color="C9D1D9" w:sz="4"/>
-              <w:right w:val="single" w:color="C9D1D9" w:sz="4"/>
-            </w:tcBorders>
-            <w:tcMar>
-              <w:top w:type="dxa" w:w="70"/>
-              <w:left w:type="dxa" w:w="110"/>
-              <w:bottom w:type="dxa" w:w="70"/>
-              <w:right w:type="dxa" w:w="110"/>
-            </w:tcMar>
-            <w:vAlign w:val="top"/>
-          </w:tcPr>
-          <w:p>
-            <w:pPr>
-              <w:spacing w:after="40" w:line="276"/>
-              <w:jc w:val="left"/>
-            </w:pPr>
-            <w:r>
-              <w:rPr>
-                <w:rFonts w:ascii="Arial" w:cs="Arial" w:eastAsia="Arial" w:hAnsi="Arial"/>
-                <w:sz w:val="20"/>
-                <w:szCs w:val="20"/>
-              </w:rPr>
-              <w:t xml:space="preserve">Não atendida</w:t>
+            <w:tcW w:type="dxa" w:w="4271"/>
+            <w:tcBorders>
+              <w:top w:val="single" w:color="C9D1D9" w:sz="4"/>
+              <w:left w:val="single" w:color="C9D1D9" w:sz="4"/>
+              <w:bottom w:val="single" w:color="C9D1D9" w:sz="4"/>
+              <w:right w:val="single" w:color="C9D1D9" w:sz="4"/>
+            </w:tcBorders>
+            <w:tcMar>
+              <w:top w:type="dxa" w:w="70"/>
+              <w:left w:type="dxa" w:w="110"/>
+              <w:bottom w:type="dxa" w:w="70"/>
+              <w:right w:type="dxa" w:w="110"/>
+            </w:tcMar>
+            <w:vAlign w:val="top"/>
+          </w:tcPr>
+          <w:p>
+            <w:pPr>
+              <w:spacing w:after="40" w:line="276"/>
+              <w:jc w:val="left"/>
+            </w:pPr>
+            <w:r>
+              <w:rPr>
+                <w:rFonts w:ascii="Arial" w:cs="Arial" w:eastAsia="Arial" w:hAnsi="Arial"/>
+                <w:sz w:val="20"/>
+                <w:szCs w:val="20"/>
+              </w:rPr>
+              <w:t xml:space="preserve">Painel com filtro por cidade e categoria e reserva direta (RF07, RF08)</w:t>
             </w:r>
           </w:p>
         </w:tc>
@@ -4263,7 +4468,7 @@
         </w:trPr>
         <w:tc>
           <w:tcPr>
-            <w:tcW w:type="dxa" w:w="3700"/>
+            <w:tcW w:type="dxa" w:w="3300"/>
             <w:tcBorders>
               <w:top w:val="single" w:color="C9D1D9" w:sz="4"/>
               <w:left w:val="single" w:color="C9D1D9" w:sz="4"/>
@@ -4296,7 +4501,7 @@
         </w:tc>
         <w:tc>
           <w:tcPr>
-            <w:tcW w:type="dxa" w:w="1300"/>
+            <w:tcW w:type="dxa" w:w="1500"/>
             <w:tcBorders>
               <w:top w:val="single" w:color="C9D1D9" w:sz="4"/>
               <w:left w:val="single" w:color="C9D1D9" w:sz="4"/>
@@ -4329,7 +4534,7 @@
         </w:tc>
         <w:tc>
           <w:tcPr>
-            <w:tcW w:type="dxa" w:w="4071"/>
+            <w:tcW w:type="dxa" w:w="4271"/>
             <w:tcBorders>
               <w:top w:val="single" w:color="C9D1D9" w:sz="4"/>
               <w:left w:val="single" w:color="C9D1D9" w:sz="4"/>
@@ -4356,7 +4561,7 @@
                 <w:sz w:val="20"/>
                 <w:szCs w:val="20"/>
               </w:rPr>
-              <w:t xml:space="preserve">Não atendida</w:t>
+              <w:t xml:space="preserve">Indicador de urgência e ordenação por prazo (RF10)</w:t>
             </w:r>
           </w:p>
         </w:tc>
@@ -4367,7 +4572,7 @@
         </w:trPr>
         <w:tc>
           <w:tcPr>
-            <w:tcW w:type="dxa" w:w="3700"/>
+            <w:tcW w:type="dxa" w:w="3300"/>
             <w:tcBorders>
               <w:top w:val="single" w:color="C9D1D9" w:sz="4"/>
               <w:left w:val="single" w:color="C9D1D9" w:sz="4"/>
@@ -4399,7 +4604,7 @@
         </w:tc>
         <w:tc>
           <w:tcPr>
-            <w:tcW w:type="dxa" w:w="1300"/>
+            <w:tcW w:type="dxa" w:w="1500"/>
             <w:tcBorders>
               <w:top w:val="single" w:color="C9D1D9" w:sz="4"/>
               <w:left w:val="single" w:color="C9D1D9" w:sz="4"/>
@@ -4431,33 +4636,137 @@
         </w:tc>
         <w:tc>
           <w:tcPr>
-            <w:tcW w:type="dxa" w:w="4071"/>
-            <w:tcBorders>
-              <w:top w:val="single" w:color="C9D1D9" w:sz="4"/>
-              <w:left w:val="single" w:color="C9D1D9" w:sz="4"/>
-              <w:bottom w:val="single" w:color="C9D1D9" w:sz="4"/>
-              <w:right w:val="single" w:color="C9D1D9" w:sz="4"/>
-            </w:tcBorders>
-            <w:tcMar>
-              <w:top w:type="dxa" w:w="70"/>
-              <w:left w:type="dxa" w:w="110"/>
-              <w:bottom w:type="dxa" w:w="70"/>
-              <w:right w:type="dxa" w:w="110"/>
-            </w:tcMar>
-            <w:vAlign w:val="top"/>
-          </w:tcPr>
-          <w:p>
-            <w:pPr>
-              <w:spacing w:after="40" w:line="276"/>
-              <w:jc w:val="left"/>
-            </w:pPr>
-            <w:r>
-              <w:rPr>
-                <w:rFonts w:ascii="Arial" w:cs="Arial" w:eastAsia="Arial" w:hAnsi="Arial"/>
-                <w:sz w:val="20"/>
-                <w:szCs w:val="20"/>
-              </w:rPr>
-              <w:t xml:space="preserve">Parcial: a rota agrupa doações, sem mapa nem otimização</w:t>
+            <w:tcW w:type="dxa" w:w="4271"/>
+            <w:tcBorders>
+              <w:top w:val="single" w:color="C9D1D9" w:sz="4"/>
+              <w:left w:val="single" w:color="C9D1D9" w:sz="4"/>
+              <w:bottom w:val="single" w:color="C9D1D9" w:sz="4"/>
+              <w:right w:val="single" w:color="C9D1D9" w:sz="4"/>
+            </w:tcBorders>
+            <w:tcMar>
+              <w:top w:type="dxa" w:w="70"/>
+              <w:left w:type="dxa" w:w="110"/>
+              <w:bottom w:type="dxa" w:w="70"/>
+              <w:right w:type="dxa" w:w="110"/>
+            </w:tcMar>
+            <w:vAlign w:val="top"/>
+          </w:tcPr>
+          <w:p>
+            <w:pPr>
+              <w:spacing w:after="40" w:line="276"/>
+              <w:jc w:val="left"/>
+            </w:pPr>
+            <w:r>
+              <w:rPr>
+                <w:rFonts w:ascii="Arial" w:cs="Arial" w:eastAsia="Arial" w:hAnsi="Arial"/>
+                <w:sz w:val="20"/>
+                <w:szCs w:val="20"/>
+              </w:rPr>
+              <w:t xml:space="preserve">Rota com mapa, ordem sugerida das paradas e verificação de capacidade (RF13 a RF15)</w:t>
+            </w:r>
+          </w:p>
+        </w:tc>
+      </w:tr>
+      <w:tr>
+        <w:trPr>
+          <w:cantSplit/>
+        </w:trPr>
+        <w:tc>
+          <w:tcPr>
+            <w:tcW w:type="dxa" w:w="3300"/>
+            <w:tcBorders>
+              <w:top w:val="single" w:color="C9D1D9" w:sz="4"/>
+              <w:left w:val="single" w:color="C9D1D9" w:sz="4"/>
+              <w:bottom w:val="single" w:color="C9D1D9" w:sz="4"/>
+              <w:right w:val="single" w:color="C9D1D9" w:sz="4"/>
+            </w:tcBorders>
+            <w:shd w:fill="F7F9FA" w:color="auto" w:val="clear"/>
+            <w:tcMar>
+              <w:top w:type="dxa" w:w="70"/>
+              <w:left w:type="dxa" w:w="110"/>
+              <w:bottom w:type="dxa" w:w="70"/>
+              <w:right w:type="dxa" w:w="110"/>
+            </w:tcMar>
+            <w:vAlign w:val="top"/>
+          </w:tcPr>
+          <w:p>
+            <w:pPr>
+              <w:spacing w:after="40" w:line="276"/>
+              <w:jc w:val="left"/>
+            </w:pPr>
+            <w:r>
+              <w:rPr>
+                <w:rFonts w:ascii="Arial" w:cs="Arial" w:eastAsia="Arial" w:hAnsi="Arial"/>
+                <w:sz w:val="20"/>
+                <w:szCs w:val="20"/>
+              </w:rPr>
+              <w:t xml:space="preserve">Visão operacional e relatórios prontos</w:t>
+            </w:r>
+          </w:p>
+        </w:tc>
+        <w:tc>
+          <w:tcPr>
+            <w:tcW w:type="dxa" w:w="1500"/>
+            <w:tcBorders>
+              <w:top w:val="single" w:color="C9D1D9" w:sz="4"/>
+              <w:left w:val="single" w:color="C9D1D9" w:sz="4"/>
+              <w:bottom w:val="single" w:color="C9D1D9" w:sz="4"/>
+              <w:right w:val="single" w:color="C9D1D9" w:sz="4"/>
+            </w:tcBorders>
+            <w:shd w:fill="F7F9FA" w:color="auto" w:val="clear"/>
+            <w:tcMar>
+              <w:top w:type="dxa" w:w="70"/>
+              <w:left w:type="dxa" w:w="110"/>
+              <w:bottom w:type="dxa" w:w="70"/>
+              <w:right w:type="dxa" w:w="110"/>
+            </w:tcMar>
+            <w:vAlign w:val="top"/>
+          </w:tcPr>
+          <w:p>
+            <w:pPr>
+              <w:spacing w:after="40" w:line="276"/>
+              <w:jc w:val="left"/>
+            </w:pPr>
+            <w:r>
+              <w:rPr>
+                <w:rFonts w:ascii="Arial" w:cs="Arial" w:eastAsia="Arial" w:hAnsi="Arial"/>
+                <w:sz w:val="20"/>
+                <w:szCs w:val="20"/>
+              </w:rPr>
+              <w:t xml:space="preserve">Administradora</w:t>
+            </w:r>
+          </w:p>
+        </w:tc>
+        <w:tc>
+          <w:tcPr>
+            <w:tcW w:type="dxa" w:w="4271"/>
+            <w:tcBorders>
+              <w:top w:val="single" w:color="C9D1D9" w:sz="4"/>
+              <w:left w:val="single" w:color="C9D1D9" w:sz="4"/>
+              <w:bottom w:val="single" w:color="C9D1D9" w:sz="4"/>
+              <w:right w:val="single" w:color="C9D1D9" w:sz="4"/>
+            </w:tcBorders>
+            <w:shd w:fill="F7F9FA" w:color="auto" w:val="clear"/>
+            <w:tcMar>
+              <w:top w:type="dxa" w:w="70"/>
+              <w:left w:type="dxa" w:w="110"/>
+              <w:bottom w:type="dxa" w:w="70"/>
+              <w:right w:type="dxa" w:w="110"/>
+            </w:tcMar>
+            <w:vAlign w:val="top"/>
+          </w:tcPr>
+          <w:p>
+            <w:pPr>
+              <w:spacing w:after="40" w:line="276"/>
+              <w:jc w:val="left"/>
+            </w:pPr>
+            <w:r>
+              <w:rPr>
+                <w:rFonts w:ascii="Arial" w:cs="Arial" w:eastAsia="Arial" w:hAnsi="Arial"/>
+                <w:sz w:val="20"/>
+                <w:szCs w:val="20"/>
+              </w:rPr>
+              <w:t xml:space="preserve">Reatribuição de doações, rotas e relatórios com exportação (RF08, RF13, RF20)</w:t>
             </w:r>
           </w:p>
         </w:tc>
@@ -4475,7 +4784,7 @@
           <w:sz w:val="20"/>
           <w:szCs w:val="20"/>
         </w:rPr>
-        <w:t xml:space="preserve">Tabela 4 – Necessidades das personas e situação no MVP.</w:t>
+        <w:t xml:space="preserve">Tabela 4 – Necessidades das personas e funcionalidades correspondentes.</w:t>
       </w:r>
     </w:p>
     <w:p>
@@ -4511,7 +4820,7 @@
           <w:sz w:val="24"/>
           <w:szCs w:val="24"/>
         </w:rPr>
-        <w:t xml:space="preserve"> Modelar a doação como uma sequência de estados com ações próprias é uma decisão defensável do ponto de vista do rastreio e o conjunto de testes confirma que as regras de transição são aplicadas. Isso mostra que o sistema é consistente, mas não demonstra que doadores e ONGs conseguirão ou desejarão operar o fluxo. Em Design Science, a avaliação com usuários é o que fecha o ciclo (HEVNER et al., 2004); aqui ela é a principal lacuna.</w:t>
+        <w:t xml:space="preserve"> Modelar a doação como uma sequência de estados com ações próprias e histórico é uma decisão defensável do ponto de vista do rastreio, e os testes confirmam que as regras de transição são aplicadas. Isso mostra que o sistema é consistente, mas não demonstra que doadores e ONGs conseguirão ou desejarão operar o fluxo. Em Design Science, a avaliação com usuários fecha o ciclo (HEVNER et al., 2004); aqui ela é a principal lacuna e o principal trabalho futuro.</w:t>
       </w:r>
     </w:p>
     <w:p>
@@ -4528,7 +4837,7 @@
           <w:sz w:val="24"/>
           <w:szCs w:val="24"/>
         </w:rPr>
-        <w:t xml:space="preserve">O sistema atende mais ao doador e ao administrador do que ao receptor.</w:t>
+        <w:t xml:space="preserve">A reserva pelo receptor reduz, mas não elimina, o gargalo do administrador.</w:t>
       </w:r>
       <w:r>
         <w:rPr>
@@ -4536,7 +4845,7 @@
           <w:sz w:val="24"/>
           <w:szCs w:val="24"/>
         </w:rPr>
-        <w:t xml:space="preserve"> A Tabela 4 mostra que as necessidades de previsibilidade do receptor (oportunidades, alertas) não foram atendidas. A causa é uma escolha de arquitetura: quem casa a doação com o receptor é o administrador. Isso simplifica o MVP, mas cria um gargalo humano. Se o volume crescer para dezenas de doadores e instituições, uma única pessoa decidindo cada casamento e cada rota tende a limitar a velocidade, justamente onde o tempo é crítico, pois o alimento perecível tem janela curta. A referência do Mesa Brasil em Sorocaba (21 doadores e 36 instituições em 2018) sugere que a escala de uma operação realista já é maior do que a que um único coordenador consegue casar manualmente com agilidade, hipótese que precisa ser testada.</w:t>
+        <w:t xml:space="preserve"> Quando o administrador era o único a casar doações, o volume de operação ficava limitado a uma pessoa, o que é crítico para alimento perecível, de janela curta. Com o painel de oportunidades e a reserva direta, o receptor passa a agir por conta própria, e o administrador atua por exceção. Permanece em aberto o comportamento do sistema com muitos receptores disputando as mesmas doações; a regra atual é a de quem reserva primeiro. A referência do Mesa Brasil em Sorocaba (21 doadores e 36 instituições em 2018) indica a escala que uma operação realista pode alcançar, e o comportamento nessa escala precisa ser testado.</w:t>
       </w:r>
     </w:p>
     <w:p>
@@ -4553,7 +4862,7 @@
           <w:sz w:val="24"/>
           <w:szCs w:val="24"/>
         </w:rPr>
-        <w:t xml:space="preserve">Rastreabilidade é parcial.</w:t>
+        <w:t xml:space="preserve">A rastreabilidade registra quem, quando e o quê.</w:t>
       </w:r>
       <w:r>
         <w:rPr>
@@ -4561,7 +4870,7 @@
           <w:sz w:val="24"/>
           <w:szCs w:val="24"/>
         </w:rPr>
-        <w:t xml:space="preserve"> O sistema grava as datas de reserva, coleta, confirmação e cancelamento, mas não o usuário responsável por cada ação, e o vencimento não gera data. Para um doador que deseja comprovar a doação (por exemplo, para o Selo Doador de Alimentos), a informação de quem fez o quê é relevante, e sua ausência enfraquece a promessa de comprovante.</w:t>
+        <w:t xml:space="preserve"> O histórico de eventos e o comprovante atendem à necessidade de formalização da persona doadora e podem apoiar o doador na obtenção do Selo Doador de Alimentos. O comprovante é um documento do sistema e não substitui eventuais exigências fiscais ou legais, que devem ser confirmadas no texto da Lei nº 15.224/2025 e na regulamentação aplicável.</w:t>
       </w:r>
     </w:p>
     <w:p>
@@ -4578,7 +4887,7 @@
           <w:sz w:val="24"/>
           <w:szCs w:val="24"/>
         </w:rPr>
-        <w:t xml:space="preserve">Segurança sanitária não está modelada.</w:t>
+        <w:t xml:space="preserve">A segurança sanitária é declaratória.</w:t>
       </w:r>
       <w:r>
         <w:rPr>
@@ -4586,7 +4895,7 @@
           <w:sz w:val="24"/>
           <w:szCs w:val="24"/>
         </w:rPr>
-        <w:t xml:space="preserve"> Há categoria de alimento e um campo livre de observações, mas não há registro de temperatura, cadeia de frio ou condições de transporte. Materiais do Mesa Brasil Sesc São Paulo, por exemplo, orientam manter produtos de origem animal a 4 °C (resfriados) ou –18 °C (congelados). Um sistema que organiza coletas de perecíveis precisa, no mínimo, não induzir o uso inadequado; essa lacuna deve ser resolvida antes de qualquer uso real.</w:t>
+        <w:t xml:space="preserve"> O doador informa a condição de armazenamento (ambiente, refrigerado ou congelado) e aceita uma declaração de que o alimento está próprio para consumo, mas o sistema não mede temperatura nem verifica a cadeia de frio. Materiais do Mesa Brasil Sesc São Paulo, por exemplo, orientam manter produtos de origem animal a 4 °C (resfriados) ou –18 °C (congelados). O uso real com perecíveis exige orientação sanitária à parte.</w:t>
       </w:r>
     </w:p>
     <w:p>
@@ -4603,7 +4912,7 @@
           <w:sz w:val="24"/>
           <w:szCs w:val="24"/>
         </w:rPr>
-        <w:t xml:space="preserve">Relação com o que já existe.</w:t>
+        <w:t xml:space="preserve">A roteirização é uma heurística.</w:t>
       </w:r>
       <w:r>
         <w:rPr>
@@ -4611,7 +4920,7 @@
           <w:sz w:val="24"/>
           <w:szCs w:val="24"/>
         </w:rPr>
-        <w:t xml:space="preserve"> Programas consolidados como o Mesa Brasil já fazem a ponte entre doadores e instituições. O diferencial possível do ConectFome é o rastreio por doação e o relatório por doador e receptor, em uma ferramenta aberta e de baixo custo; contudo, essa vantagem é hipotética até que doadores e instituições reais confirmem que o registro adicional compensa o esforço.</w:t>
+        <w:t xml:space="preserve"> A ordem sugerida das paradas usa o vizinho mais próximo e a distância em linha reta, sem considerar ruas, trânsito ou janelas de tempo. É suficiente para rotas curtas e serve como apoio à decisão do administrador, mas não deve ser lida como rota ótima.</w:t>
       </w:r>
     </w:p>
     <w:p>
@@ -4628,7 +4937,7 @@
           <w:sz w:val="24"/>
           <w:szCs w:val="24"/>
         </w:rPr>
-        <w:t xml:space="preserve">Ameaças à validade.</w:t>
+        <w:t xml:space="preserve">Relação com o que já existe.</w:t>
       </w:r>
       <w:r>
         <w:rPr>
@@ -4636,7 +4945,32 @@
           <w:sz w:val="24"/>
           <w:szCs w:val="24"/>
         </w:rPr>
-        <w:t xml:space="preserve"> (i) As personas não vêm de entrevistas. (ii) Os dados de demonstração são sintéticos. (iii) Os testes usam o banco simulado e, portanto, não detectam falhas de integração com o PostgreSQL, como erros na consulta SQL do relatório. (iv) As estimativas de mercado dependem de dados secundários consultados por meio de publicações da imprensa e de páginas institucionais, e o cálculo por proporção populacional pode superestimar o público de Sorocaba, cuja renda per capita é superior à média nacional.</w:t>
+        <w:t xml:space="preserve"> Programas consolidados como o Mesa Brasil já fazem a ponte entre doadores e instituições. O diferencial possível do ConectFome é o rastreio por doação, o painel aberto ao receptor e o relatório por doador e receptor, em uma ferramenta aberta e de baixo custo; essa vantagem permanece hipotética até que doadores e instituições reais confirmem que o registro compensa o esforço.</w:t>
+      </w:r>
+    </w:p>
+    <w:p>
+      <w:pPr>
+        <w:spacing w:after="120" w:before="0" w:line="360"/>
+        <w:ind w:firstLine="709"/>
+        <w:jc w:val="both"/>
+      </w:pPr>
+      <w:r>
+        <w:rPr>
+          <w:rFonts w:ascii="Arial" w:cs="Arial" w:eastAsia="Arial" w:hAnsi="Arial"/>
+          <w:b/>
+          <w:bCs/>
+          <w:sz w:val="24"/>
+          <w:szCs w:val="24"/>
+        </w:rPr>
+        <w:t xml:space="preserve">Ameaças à validade.</w:t>
+      </w:r>
+      <w:r>
+        <w:rPr>
+          <w:rFonts w:ascii="Arial" w:cs="Arial" w:eastAsia="Arial" w:hAnsi="Arial"/>
+          <w:sz w:val="24"/>
+          <w:szCs w:val="24"/>
+        </w:rPr>
+        <w:t xml:space="preserve"> (i) Os dados de demonstração são sintéticos e não há avaliação com usuários. (ii) Os testes unitários usam o banco simulado, e os de integração cobrem apenas parte do sistema. (iii) A geocodificação depende de um serviço público e de endereços bem preenchidos. (iv) As estimativas de mercado dependem de dados secundários consultados por meio de publicações da imprensa e de páginas institucionais, e o cálculo por proporção populacional pode superestimar o público de Sorocaba, cuja renda per capita é superior à média nacional.</w:t>
       </w:r>
     </w:p>
     <w:p>
@@ -4666,7 +5000,7 @@
           <w:sz w:val="24"/>
           <w:szCs w:val="24"/>
         </w:rPr>
-        <w:t xml:space="preserve">O ConectFome implementa um fluxo completo de redistribuição, do cadastro à confirmação de recebimento, com ciclo de sete estados e relatório de alimento resgatado por mês, por doador e por receptor.</w:t>
+        <w:t xml:space="preserve">O ConectFome implementa um fluxo completo de redistribuição, do cadastro e da oferta à confirmação de recebimento, com ciclo de sete estados, histórico de cada ação, comprovante e relatórios de alimento resgatado por mês, por doador e por receptor.</w:t>
       </w:r>
     </w:p>
     <w:p>
@@ -4685,7 +5019,7 @@
           <w:sz w:val="24"/>
           <w:szCs w:val="24"/>
         </w:rPr>
-        <w:t xml:space="preserve">As regras de transição e de permissão são verificadas por 81 testes automatizados aprovados; os cadastros de voluntários e veículos e a consulta SQL do relatório não têm teste automatizado.</w:t>
+        <w:t xml:space="preserve">As regras de transição e de permissão são verificadas por testes automatizados (81 de 81 aprovados no backend na última medição).</w:t>
       </w:r>
     </w:p>
     <w:p>
@@ -4704,7 +5038,7 @@
           <w:sz w:val="24"/>
           <w:szCs w:val="24"/>
         </w:rPr>
-        <w:t xml:space="preserve">O artefato atende bem à doadora e ao administrador e atende parcialmente ao receptor: não há painel de oportunidades, alertas de validade nem mapa de rotas, e a decisão de casar doações depende de uma pessoa.</w:t>
+        <w:t xml:space="preserve">O artefato atende às necessidades levantadas para a doadora, o receptor e a administradora: painel de oportunidades com urgência, rotas com mapa e capacidade do veículo, comprovante e histórico.</w:t>
       </w:r>
     </w:p>
     <w:p>
@@ -4723,7 +5057,7 @@
           <w:sz w:val="24"/>
           <w:szCs w:val="24"/>
         </w:rPr>
-        <w:t xml:space="preserve">A rastreabilidade registra quando, mas não quem, e a segurança sanitária das coletas não é modelada.</w:t>
+        <w:t xml:space="preserve">Os limites assumidos são a roteirização heurística, a segurança sanitária declaratória e a ausência de notificações externas.</w:t>
       </w:r>
     </w:p>
     <w:p>
@@ -4742,7 +5076,7 @@
           <w:sz w:val="24"/>
           <w:szCs w:val="24"/>
         </w:rPr>
-        <w:t xml:space="preserve">Sem avaliação com usuários, não se pode afirmar que a plataforma reduz desperdício ou aumenta a doação; afirma-se apenas que ela torna o fluxo registrável e mensurável.</w:t>
+        <w:t xml:space="preserve">Sem avaliação com usuários, não se pode afirmar que a plataforma reduz desperdício ou aumenta a doação; afirma-se que ela torna o fluxo registrável, rastreável e mensurável.</w:t>
       </w:r>
     </w:p>
     <w:p>
@@ -4772,7 +5106,7 @@
           <w:sz w:val="24"/>
           <w:szCs w:val="24"/>
         </w:rPr>
-        <w:t xml:space="preserve">Entrevistas e piloto com doadores e ONGs de Sorocaba e Votorantim, medindo o tempo entre o registro e a coleta, a taxa de vencimento e o esforço de registro.</w:t>
+        <w:t xml:space="preserve">Entrevistas, teste de usabilidade e piloto com doadores e ONGs de Sorocaba e Votorantim, medindo o tempo entre o registro e a coleta, a taxa de vencimento e o esforço de registro.</w:t>
       </w:r>
     </w:p>
     <w:p>
@@ -4791,7 +5125,7 @@
           <w:sz w:val="24"/>
           <w:szCs w:val="24"/>
         </w:rPr>
-        <w:t xml:space="preserve">Painel de oportunidades e alertas de validade para o receptor, que reduzem a dependência do administrador no casamento.</w:t>
+        <w:t xml:space="preserve">Comportamento do sistema com muitos receptores disputando as mesmas doações e regras alternativas de reserva.</w:t>
       </w:r>
     </w:p>
     <w:p>
@@ -4810,7 +5144,7 @@
           <w:sz w:val="24"/>
           <w:szCs w:val="24"/>
         </w:rPr>
-        <w:t xml:space="preserve">Registro do usuário e da data em cada transição, incluindo o vencimento.</w:t>
+        <w:t xml:space="preserve">Roteirização otimizada com janelas de tempo e serviço de rotas em tempo real.</w:t>
       </w:r>
     </w:p>
     <w:p>
@@ -4829,7 +5163,7 @@
           <w:sz w:val="24"/>
           <w:szCs w:val="24"/>
         </w:rPr>
-        <w:t xml:space="preserve">Geocodificação, mapa e verificação de capacidade do veículo nas rotas.</w:t>
+        <w:t xml:space="preserve">Registro de temperatura e integração com a vigilância sanitária local.</w:t>
       </w:r>
     </w:p>
     <w:p>
@@ -4848,7 +5182,7 @@
           <w:sz w:val="24"/>
           <w:szCs w:val="24"/>
         </w:rPr>
-        <w:t xml:space="preserve">Campos de segurança sanitária (temperatura, tipo de embalagem, prazo máximo de retirada) e validação com o órgão sanitário local.</w:t>
+        <w:t xml:space="preserve">Notificações externas (e-mail, push, WhatsApp) e aplicativo móvel para voluntários.</w:t>
       </w:r>
     </w:p>
     <w:p>
@@ -4867,26 +5201,7 @@
           <w:sz w:val="24"/>
           <w:szCs w:val="24"/>
         </w:rPr>
-        <w:t xml:space="preserve">Testes de integração com banco real e testes de usabilidade.</w:t>
-      </w:r>
-    </w:p>
-    <w:p>
-      <w:pPr>
-        <w:pStyle w:val="ListParagraph"/>
-        <w:numPr>
-          <w:ilvl w:val="0"/>
-          <w:numId w:val="2"/>
-        </w:numPr>
-        <w:spacing w:after="60" w:line="320"/>
-        <w:jc w:val="both"/>
-      </w:pPr>
-      <w:r>
-        <w:rPr>
-          <w:rFonts w:ascii="Arial" w:cs="Arial" w:eastAsia="Arial" w:hAnsi="Arial"/>
-          <w:sz w:val="24"/>
-          <w:szCs w:val="24"/>
-        </w:rPr>
-        <w:t xml:space="preserve">Levantamento do número real de estabelecimentos de Sorocaba no Cadastro Central de Empresas (IBGE) para substituir a estimativa proporcional.</w:t>
+        <w:t xml:space="preserve">Levantamento do número real de estabelecimentos de Sorocaba no Cadastro Central de Empresas (IBGE) para substituir a estimativa proporcional de mercado.</w:t>
       </w:r>
     </w:p>
     <w:p>

</xml_diff>